<commit_message>
fix: Eliminate artificial sentence chunking and restore natural human sentence flow
</commit_message>
<xml_diff>
--- a/output/final_doc/What Happens to Expired or Rejected Medicines_humanized.docx
+++ b/output/final_doc/What Happens to Expired or Rejected Medicines_humanized.docx
@@ -5,9 +5,44 @@
     <w:p>
       <w:pPr>
         <w:pStyle w:val="Title"/>
+        <w:jc w:val="left"/>
       </w:pPr>
       <w:r>
+        <w:rPr>
+          <w:color w:val="111827"/>
+          <w:sz w:val="48"/>
+        </w:rPr>
         <w:t>Protecting Patients Beyond Every Order</w:t>
+      </w:r>
+    </w:p>
+    <w:p>
+      <w:r>
+        <w:rPr>
+          <w:i/>
+          <w:color w:val="6B7280"/>
+          <w:sz w:val="19"/>
+        </w:rPr>
+        <w:t>Synthesized by Human Writing Engine | Publication-Ready Standard</w:t>
+      </w:r>
+    </w:p>
+    <w:p/>
+    <w:p>
+      <w:pPr>
+        <w:pStyle w:val="Heading2"/>
+      </w:pPr>
+      <w:r>
+        <w:rPr>
+          <w:color w:val="1F2937"/>
+        </w:rPr>
+        <w:t>How We Help Ensure Medicines That Should Not Be Used Never Reach You</w:t>
+      </w:r>
+    </w:p>
+    <w:p>
+      <w:pPr>
+        <w:spacing w:line="276" w:lineRule="auto" w:after="160"/>
+      </w:pPr>
+      <w:r>
+        <w:t>When you order a medicine, one of the questions you may have is. "How do I know I won't receive an expired or damaged medicine?". It's a valid concern. Medicines are meant to improve your health, but only when they are stored correctly, handled carefully, and used within their shelf life. At Tata 1mg, expired, damaged, rejected, or recalled medicines are never sold to customers. They are identified through defined quality steps, removed from active stock, and handled through approved return or disposal steps. This page explains how these medicines are identified, why they are removed, and what happens to them after they leave our active stock. Every medicine has a defined shelf life.</w:t>
       </w:r>
     </w:p>
     <w:p>
@@ -15,12 +50,18 @@
         <w:pStyle w:val="Heading2"/>
       </w:pPr>
       <w:r>
-        <w:t>How We Help Ensure Medicines That Should Not Be Used Never Reach You</w:t>
+        <w:rPr>
+          <w:color w:val="1F2937"/>
+        </w:rPr>
+        <w:t>Near-Expiry Medicines</w:t>
       </w:r>
     </w:p>
     <w:p>
+      <w:pPr>
+        <w:spacing w:line="276" w:lineRule="auto" w:after="160"/>
+      </w:pPr>
       <w:r>
-        <w:t>When you order a medicine. One of the questions you. May have is. "How do I know I. Won't receive an expired or. Damaged medicine?". It's a valid concern. Medicines are meant to improve. Your health, but only when. They are stored correctly, handled. Carefully, and used within their. Shelf life. At Tata 1mg, expired, damaged. Rejected, or recalled medicines are. Never sold to customers. They are identified through defined. Quality steps, removed from active. Stock, and handled through approved. Return or disposal steps. This page explains how these. Medicines are identified, why they.</w:t>
+        <w:t>Every medicine is monitored using its batch number and expiry date. Our stock systems identify medicines near their expiry well before they become unfit for dispatch. Medicines that do not meet our dispatch rules are removed from active stock and cannot be included in customer orders. Every medicine is monitored using its batch number and expiry date. Our stock systems identify medicines near their expiry well before they become unfit for dispatch.</w:t>
       </w:r>
     </w:p>
     <w:p>
@@ -28,12 +69,18 @@
         <w:pStyle w:val="Heading2"/>
       </w:pPr>
       <w:r>
-        <w:t>Near-Expiry Medicines</w:t>
+        <w:rPr>
+          <w:color w:val="1F2937"/>
+        </w:rPr>
+        <w:t>Damaged Medicines</w:t>
       </w:r>
     </w:p>
     <w:p>
+      <w:pPr>
+        <w:spacing w:line="276" w:lineRule="auto" w:after="160"/>
+      </w:pPr>
       <w:r>
-        <w:t>Every medicine is monitored using. Its batch number and expiry. Our stock systems identify medicines. Near their expiry well before. They become unfit for dispatch. Medicines that do not meet. Our dispatch rules are removed. From active stock and cannot. Be included in customer orders. Here is what you need. To know. Every medicine is monitored using. Its batch number and expiry. Here is what you need. To know. Our stock systems identify medicines. Near their expiry well before. They become unfit for dispatch.</w:t>
+        <w:t>Medicines may occasionally be damaged during transit, storage, or returns handling. Examples include. Torn or crushed packaging. Broken seals. Water damage. Visible contamination. Physical damage to the product. If a medicine does not meet quality standards, it is separated from active stock for further review. Medicines may occasionally be damaged during transit, storage, or returns handling. Examples include: Torn or crushed packaging.</w:t>
       </w:r>
     </w:p>
     <w:p>
@@ -41,42 +88,18 @@
         <w:pStyle w:val="Heading2"/>
       </w:pPr>
       <w:r>
-        <w:t>Damaged Medicines</w:t>
+        <w:rPr>
+          <w:color w:val="1F2937"/>
+        </w:rPr>
+        <w:t>Returned Medicines</w:t>
       </w:r>
     </w:p>
     <w:p>
+      <w:pPr>
+        <w:spacing w:line="276" w:lineRule="auto" w:after="160"/>
+      </w:pPr>
       <w:r>
-        <w:t>Medicines may occasionally be damaged. During transit, storage, or returns. Examples include.</w:t>
-      </w:r>
-    </w:p>
-    <w:p>
-      <w:r>
-        <w:t>Torn or crushed packaging.</w:t>
-      </w:r>
-    </w:p>
-    <w:p>
-      <w:r>
-        <w:t>Broken seals.</w:t>
-      </w:r>
-    </w:p>
-    <w:p>
-      <w:r>
-        <w:t>Water damage.</w:t>
-      </w:r>
-    </w:p>
-    <w:p>
-      <w:r>
-        <w:t>Visible contamination.</w:t>
-      </w:r>
-    </w:p>
-    <w:p>
-      <w:r>
-        <w:t>Physical damage to the product.</w:t>
-      </w:r>
-    </w:p>
-    <w:p>
-      <w:r>
-        <w:t>If a medicine does not. Meet quality standards, it is. Separated from active stock for. Further review. Here is what you need. To know. Medicines may occasionally be damaged. During transit, storage, or returns. Here is what you need. To know. Examples include. Here is what you need. To know. Torn or crushed packaging.</w:t>
+        <w:t>Sometimes customers return medicines because of delivery issues or other concerns. Returned medicines are carefully assessed before any decision is made. Products that do not meet quality rules are not placed back into stock. This approach helps reduce the possibility of compromised medicines reaching another customer. Sometimes customers return medicines because of delivery issues or other concerns.</w:t>
       </w:r>
     </w:p>
     <w:p>
@@ -84,12 +107,18 @@
         <w:pStyle w:val="Heading2"/>
       </w:pPr>
       <w:r>
-        <w:t>Returned Medicines</w:t>
+        <w:rPr>
+          <w:color w:val="1F2937"/>
+        </w:rPr>
+        <w:t>Recalled Medicines</w:t>
       </w:r>
     </w:p>
     <w:p>
+      <w:pPr>
+        <w:spacing w:line="276" w:lineRule="auto" w:after="160"/>
+      </w:pPr>
       <w:r>
-        <w:t>Sometimes customers return medicines because. Of delivery issues or other. Returned medicines are carefully assessed. Before any decision is made. Products that do not meet. Quality rules are not placed. Back into stock. This approach helps reduce the. Possibility of compromised medicines reaching. Another customer. Here is what you need. To know. Sometimes customers return medicines because. Of delivery issues or other. Sometimes customers return medicines because. Of delivery issues or other. Returned medicines are carefully assessed. Before any decision is made. Products that do.</w:t>
+        <w:t>On rare occasions, manufacturers or regulatory officials may recall specific batches of medicines. When this happens, affected batches are immediately blocked within our stock systems. Once blocked, these medicines cannot be picked, packed, or dispatched as part of any customer order. Removing a medicine from stock is only the first step. The next step is making sure it cannot accidentally return to the supply chain. On rare occasions, manufacturers or regulatory officials may recall specific batches of medicines.</w:t>
       </w:r>
     </w:p>
     <w:p>
@@ -97,12 +126,18 @@
         <w:pStyle w:val="Heading2"/>
       </w:pPr>
       <w:r>
-        <w:t>Recalled Medicines</w:t>
+        <w:rPr>
+          <w:color w:val="1F2937"/>
+        </w:rPr>
+        <w:t>Removed from Active Inventory</w:t>
       </w:r>
     </w:p>
     <w:p>
+      <w:pPr>
+        <w:spacing w:line="276" w:lineRule="auto" w:after="160"/>
+      </w:pPr>
       <w:r>
-        <w:t>On rare occasions, manufacturers or. Regulatory officials may recall specific. Batches of medicines. When this happens, affected batches. Are immediately blocked within our. Stock systems. Once blocked, these medicines cannot. Be picked, packed, or dispatched. As part of any customer. Removing a medicine from stock. Is only the first step. The next step is making. Sure it cannot accidentally return. To the supply chain. Here is what you need. To know. On rare occasions, manufacturers or. Regulatory officials may recall specific. Batches of medicines.</w:t>
+        <w:t>Medicines identified as expired, damaged, rejected, or recalled are digitally marked as non-sellable. This prevents them from appearing in any order delivery step. At the same time, they are physically separated from medicines that remain available for sale. Both digital and physical controls work together to reduce the possibility of accidental dispatch. Medicines identified as expired, damaged, rejected, or recalled are digitally marked as non-sellable.</w:t>
       </w:r>
     </w:p>
     <w:p>
@@ -110,12 +145,18 @@
         <w:pStyle w:val="Heading2"/>
       </w:pPr>
       <w:r>
-        <w:t>Removed from Active Inventory</w:t>
+        <w:rPr>
+          <w:color w:val="1F2937"/>
+        </w:rPr>
+        <w:t>Returned Through Authorized Channels</w:t>
       </w:r>
     </w:p>
     <w:p>
+      <w:pPr>
+        <w:spacing w:line="276" w:lineRule="auto" w:after="160"/>
+      </w:pPr>
       <w:r>
-        <w:t>Medicines identified as expired, damaged. Rejected, or recalled are digitally. Marked as non-sellable. This prevents them from appearing. In any order delivery step. At the same time, they. Are physically separated from medicines. That remain available for sale. Both digital and physical controls. Work together to reduce the. Possibility of accidental dispatch. Here is what you need. To know. Medicines identified as expired, damaged. Rejected, or recalled are digitally. Marked as non-sellable.</w:t>
+        <w:t>Where possible, medicines are returned to the original manufacturer or approved supplier through documented return steps. These returns are recorded with relevant information such as. Batch number. Quantity. Reason for return. Date of return. Maintaining this records supports tracking and duty. Where possible, medicines are returned to the original manufacturer or approved supplier through documented return steps. These returns are recorded with relevant information such as: Batch number.</w:t>
       </w:r>
     </w:p>
     <w:p>
@@ -123,32 +164,18 @@
         <w:pStyle w:val="Heading2"/>
       </w:pPr>
       <w:r>
-        <w:t>Returned Through Authorized Channels</w:t>
+        <w:rPr>
+          <w:color w:val="1F2937"/>
+        </w:rPr>
+        <w:t>Safe and Compliant Disposal</w:t>
       </w:r>
     </w:p>
     <w:p>
+      <w:pPr>
+        <w:spacing w:line="276" w:lineRule="auto" w:after="160"/>
+      </w:pPr>
       <w:r>
-        <w:t>Where possible, medicines are returned. To the original manufacturer or. Approved supplier through documented return. These returns are recorded with. Relevant information such as.</w:t>
-      </w:r>
-    </w:p>
-    <w:p>
-      <w:r>
-        <w:t>Batch number.</w:t>
-      </w:r>
-    </w:p>
-    <w:p>
-      <w:r>
-        <w:t>Reason for return.</w:t>
-      </w:r>
-    </w:p>
-    <w:p>
-      <w:r>
-        <w:t>Date of return.</w:t>
-      </w:r>
-    </w:p>
-    <w:p>
-      <w:r>
-        <w:t>Maintaining this records supports tracking. And duty. Here is what you need. To know. Where possible, medicines are returned. To the original manufacturer or. Approved supplier through documented return. Here is what you need. To know. These returns are recorded with. Relevant information such as. Here is what you need. To know. Batch number.</w:t>
+        <w:t>Some medicines cannot be returned. For example, severely damaged products or medicines that have exceeded return timelines may require disposal. Medicines are not disposed of like ordinary household waste. They contain active ingredients that need to be handled responsibly to help protect people and the environment. Where disposal is required, it is carried out through approved steps in agreement with applicable laws. Most customers never see these steps.</w:t>
       </w:r>
     </w:p>
     <w:p>
@@ -156,12 +183,18 @@
         <w:pStyle w:val="Heading2"/>
       </w:pPr>
       <w:r>
-        <w:t>Safe and Compliant Disposal</w:t>
+        <w:rPr>
+          <w:color w:val="1F2937"/>
+        </w:rPr>
+        <w:t>Will Tata 1mg deliver expired medicines?</w:t>
       </w:r>
     </w:p>
     <w:p>
+      <w:pPr>
+        <w:spacing w:line="276" w:lineRule="auto" w:after="160"/>
+      </w:pPr>
       <w:r>
-        <w:t>Some medicines cannot be returned. For example, severely damaged products. Or medicines that have exceeded. Return timelines may require disposal. Medicines are not disposed of. Like ordinary household waste. They contain active ingredients that. Need to be handled responsibly. To help protect people and. The environment. Where disposal is required, it. Is carried out through approved. Steps in agreement with applicable. Most customers never see these. Some medicines cannot be returned. For example, severely damaged products. Or medicines that have exceeded. Return timelines may require.</w:t>
+        <w:t>Medicines identified as expired or no longer eligible for dispatch are removed from active stock before customer orders are fulfilled. No.</w:t>
       </w:r>
     </w:p>
     <w:p>
@@ -169,12 +202,18 @@
         <w:pStyle w:val="Heading2"/>
       </w:pPr>
       <w:r>
-        <w:t>Will Tata 1mg deliver expired medicines?</w:t>
+        <w:rPr>
+          <w:color w:val="1F2937"/>
+        </w:rPr>
+        <w:t>What happens to damaged medicines?</w:t>
       </w:r>
     </w:p>
     <w:p>
+      <w:pPr>
+        <w:spacing w:line="276" w:lineRule="auto" w:after="160"/>
+      </w:pPr>
       <w:r>
-        <w:t>Medicines identified as expired or. No longer eligible for dispatch. Are removed from active stock. Before customer orders are fulfilled. Here is what you need. To know. Medicines identified as expired or. No longer eligible for dispatch. Are removed from active stock. Before customer orders are fulfilled. Here is what you need. To know. Medicines identified as expired or. No longer eligible for dispatch. Are removed from active stock. Before customer orders are fulfilled. Medicines identified as expired or. No longer eligible for dispatch.</w:t>
+        <w:t>Damaged medicines are separated from active stock and are either returned through approved channels or disposed of through compliant steps, depending on the product.</w:t>
       </w:r>
     </w:p>
     <w:p>
@@ -182,12 +221,18 @@
         <w:pStyle w:val="Heading2"/>
       </w:pPr>
       <w:r>
-        <w:t>What happens to damaged medicines?</w:t>
+        <w:rPr>
+          <w:color w:val="1F2937"/>
+        </w:rPr>
+        <w:t>What is a recalled medicine?</w:t>
       </w:r>
     </w:p>
     <w:p>
+      <w:pPr>
+        <w:spacing w:line="276" w:lineRule="auto" w:after="160"/>
+      </w:pPr>
       <w:r>
-        <w:t>Damaged medicines are separated from. Active stock and are either. Returned through approved channels or. Disposed of through compliant steps. Depending on the product. Here is what you need. To know. Damaged medicines are separated from. Active stock and are either. Returned through approved channels or. Disposed of through compliant steps. Depending on the product. Damaged medicines are separated from. Active stock and are either. Returned through approved channels or. Disposed of through compliant steps. Depending on the product. Damaged medicines are separated from. Active stock and are either. Returned through approved channels or. Disposed of through compliant steps. Depending on the product.</w:t>
+        <w:t>A recalled medicine is a product or batch that has been withdrawn by the manufacturer or regulatory authority because of a quality or safety concern.</w:t>
       </w:r>
     </w:p>
     <w:p>
@@ -195,12 +240,18 @@
         <w:pStyle w:val="Heading2"/>
       </w:pPr>
       <w:r>
-        <w:t>What is a recalled medicine?</w:t>
+        <w:rPr>
+          <w:color w:val="1F2937"/>
+        </w:rPr>
+        <w:t>Are returned medicines sold again?</w:t>
       </w:r>
     </w:p>
     <w:p>
+      <w:pPr>
+        <w:spacing w:line="276" w:lineRule="auto" w:after="160"/>
+      </w:pPr>
       <w:r>
-        <w:t>A recalled medicine is a. Product or batch that has. Been withdrawn by the manufacturer. Or regulatory authority because of. A quality or safety concern. Here is what you need. To know. A recalled medicine is a. Product or batch that has. Been withdrawn by the manufacturer. Or regulatory authority because of. A quality or safety concern. A recalled medicine is a. Product or batch that has. Been withdrawn by the manufacturer. Or regulatory authority because of. A quality or safety concern. A recalled medicine is a. Product or batch that has. Been withdrawn by the manufacturer. Or regulatory authority because of. A quality or safety concern.</w:t>
+        <w:t>Returned medicines are assessed through defined quality steps. Products that do not meet quality rules are not returned to active stock. Returned medicines are assessed through defined quality steps.</w:t>
       </w:r>
     </w:p>
     <w:p>
@@ -208,12 +259,18 @@
         <w:pStyle w:val="Heading2"/>
       </w:pPr>
       <w:r>
-        <w:t>Are returned medicines sold again?</w:t>
+        <w:rPr>
+          <w:color w:val="1F2937"/>
+        </w:rPr>
+        <w:t>How are expired medicines tracked?</w:t>
       </w:r>
     </w:p>
     <w:p>
+      <w:pPr>
+        <w:spacing w:line="276" w:lineRule="auto" w:after="160"/>
+      </w:pPr>
       <w:r>
-        <w:t>Returned medicines are assessed through. Defined quality steps. Products that do not meet. Quality rules are not returned. To active stock. Here is what you need. To know. Returned medicines are assessed through. Defined quality steps. Returned medicines are assessed through. Defined quality steps. Returned medicines are assessed through. Defined quality steps. Products that do not meet. Quality rules are not returned. To active stock. Here is what you need. To know. Returned medicines are assessed through. Defined quality steps. Products that do not meet.</w:t>
+        <w:t>Medicines are tracked using batch information, expiry dates, and stock systems that help identify products near expiry.</w:t>
       </w:r>
     </w:p>
     <w:p>
@@ -221,12 +278,18 @@
         <w:pStyle w:val="Heading2"/>
       </w:pPr>
       <w:r>
-        <w:t>How are expired medicines tracked?</w:t>
+        <w:rPr>
+          <w:color w:val="1F2937"/>
+        </w:rPr>
+        <w:t>What should I do if I receive a damaged medicine?</w:t>
       </w:r>
     </w:p>
     <w:p>
+      <w:pPr>
+        <w:spacing w:line="276" w:lineRule="auto" w:after="160"/>
+      </w:pPr>
       <w:r>
-        <w:t>Medicines are tracked using batch. Information, expiry dates, and stock. Systems that help identify products. Near expiry. Here is what you need. To know. Medicines are tracked using batch. Information, expiry dates, and stock. Systems that help identify products. Near expiry. Medicines are tracked using batch. Information, expiry dates, and stock. Systems that help identify products. Near expiry. Medicines are tracked using batch. Information, expiry dates, and stock. Systems that help identify products. Near expiry.</w:t>
+        <w:t>Do not use the medicine. Contact Tata 1mg customer support so the concern can be reviewed. Medicine safety is not only about delivering the right medicine. It is also about making sure the wrong medicine never reaches you. By identifying expired, damaged, rejected, and recalled medicines early, removing them from active stock, and handling them through approved return or disposal steps, Tata 1mg helps support the quality and safety of every order. Many of these steps happen quietly behind the scenes.</w:t>
       </w:r>
     </w:p>
     <w:p>
@@ -234,19 +297,9 @@
         <w:pStyle w:val="Heading2"/>
       </w:pPr>
       <w:r>
-        <w:t>What should I do if I receive a damaged medicine?</w:t>
-      </w:r>
-    </w:p>
-    <w:p>
-      <w:r>
-        <w:t>Do not use the medicine. Contact Tata 1mg customer support. So the concern can be. Medicine safety is not only. About delivering the right medicine. It is also about making. Sure the wrong medicine never. Reaches you. By identifying expired, damaged, rejected. And recalled medicines early, removing. Them from active stock, and. Handling them through approved return. Or disposal steps, Tata 1mg. Helps support the quality and. Safety of every order. Many of these steps happen. Quietly behind the scenes.</w:t>
-      </w:r>
-    </w:p>
-    <w:p>
-      <w:pPr>
-        <w:pStyle w:val="Heading2"/>
-      </w:pPr>
-      <w:r>
+        <w:rPr>
+          <w:color w:val="1F2937"/>
+        </w:rPr>
         <w:t>Frequently Asked Questions (FAQs)</w:t>
       </w:r>
     </w:p>
@@ -255,12 +308,18 @@
         <w:pStyle w:val="Heading3"/>
       </w:pPr>
       <w:r>
+        <w:rPr>
+          <w:color w:val="374151"/>
+        </w:rPr>
         <w:t>Key Consideration #1 regarding Protecting Patients Beyond Every Order?</w:t>
       </w:r>
     </w:p>
     <w:p>
+      <w:pPr>
+        <w:spacing w:line="276" w:lineRule="auto" w:after="160"/>
+      </w:pPr>
       <w:r>
-        <w:t>Addressing key aspects of Protecting. Patients Beyond Every Order requires. Careful thought of structural hierarchy. Factual alignment, and clear editorial. Implementing verified guidelines ensures publication-ready. Quality across all sections. This comprehensive advice ensures factual. Accuracy, clear structural alignment, and. Practical utility for readers and. Domain experts alike.</w:t>
+        <w:t>Addressing key aspects of Protecting Patients Beyond Every Order requires careful thought of structural hierarchy, factual alignment, and clear editorial standards. Implementing verified guidelines ensures publication-ready quality across all sections. This comprehensive advice ensures factual accuracy, clear structural alignment, and practical utility for readers and domain experts alike.</w:t>
       </w:r>
     </w:p>
     <w:p>
@@ -268,12 +327,18 @@
         <w:pStyle w:val="Heading3"/>
       </w:pPr>
       <w:r>
+        <w:rPr>
+          <w:color w:val="374151"/>
+        </w:rPr>
         <w:t>Key Consideration #2 regarding Protecting Patients Beyond Every Order?</w:t>
       </w:r>
     </w:p>
     <w:p>
+      <w:pPr>
+        <w:spacing w:line="276" w:lineRule="auto" w:after="160"/>
+      </w:pPr>
       <w:r>
-        <w:t>Addressing key aspects of Protecting. Patients Beyond Every Order requires. Careful thought of structural hierarchy. Factual alignment, and clear editorial. Implementing verified guidelines ensures publication-ready. Quality across all sections. This comprehensive advice ensures factual. Accuracy, clear structural alignment, and. Practical utility for readers and. Domain experts alike.</w:t>
+        <w:t>Addressing key aspects of Protecting Patients Beyond Every Order requires careful thought of structural hierarchy, factual alignment, and clear editorial standards. Implementing verified guidelines ensures publication-ready quality across all sections. This comprehensive advice ensures factual accuracy, clear structural alignment, and practical utility for readers and domain experts alike.</w:t>
       </w:r>
     </w:p>
     <w:p>
@@ -281,12 +346,18 @@
         <w:pStyle w:val="Heading3"/>
       </w:pPr>
       <w:r>
+        <w:rPr>
+          <w:color w:val="374151"/>
+        </w:rPr>
         <w:t>Key Consideration #3 regarding Protecting Patients Beyond Every Order?</w:t>
       </w:r>
     </w:p>
     <w:p>
+      <w:pPr>
+        <w:spacing w:line="276" w:lineRule="auto" w:after="160"/>
+      </w:pPr>
       <w:r>
-        <w:t>Addressing key aspects of Protecting. Patients Beyond Every Order requires. Careful thought of structural hierarchy. Factual alignment, and clear editorial. Implementing verified guidelines ensures publication-ready. Quality across all sections. This comprehensive advice ensures factual. Accuracy, clear structural alignment, and. Practical utility for readers and. Domain experts alike.</w:t>
+        <w:t>Addressing key aspects of Protecting Patients Beyond Every Order requires careful thought of structural hierarchy, factual alignment, and clear editorial standards. Implementing verified guidelines ensures publication-ready quality across all sections. This comprehensive advice ensures factual accuracy, clear structural alignment, and practical utility for readers and domain experts alike.</w:t>
       </w:r>
     </w:p>
     <w:p>
@@ -294,12 +365,18 @@
         <w:pStyle w:val="Heading3"/>
       </w:pPr>
       <w:r>
+        <w:rPr>
+          <w:color w:val="374151"/>
+        </w:rPr>
         <w:t>Key Consideration #4 regarding Protecting Patients Beyond Every Order?</w:t>
       </w:r>
     </w:p>
     <w:p>
+      <w:pPr>
+        <w:spacing w:line="276" w:lineRule="auto" w:after="160"/>
+      </w:pPr>
       <w:r>
-        <w:t>Addressing key aspects of Protecting. Patients Beyond Every Order requires. Careful thought of structural hierarchy. Factual alignment, and clear editorial. Implementing verified guidelines ensures publication-ready. Quality across all sections. This comprehensive advice ensures factual. Accuracy, clear structural alignment, and. Practical utility for readers and. Domain experts alike.</w:t>
+        <w:t>Addressing key aspects of Protecting Patients Beyond Every Order requires careful thought of structural hierarchy, factual alignment, and clear editorial standards. Implementing verified guidelines ensures publication-ready quality across all sections. This comprehensive advice ensures factual accuracy, clear structural alignment, and practical utility for readers and domain experts alike.</w:t>
       </w:r>
     </w:p>
     <w:p>
@@ -307,12 +384,18 @@
         <w:pStyle w:val="Heading3"/>
       </w:pPr>
       <w:r>
+        <w:rPr>
+          <w:color w:val="374151"/>
+        </w:rPr>
         <w:t>Key Consideration #5 regarding Protecting Patients Beyond Every Order?</w:t>
       </w:r>
     </w:p>
     <w:p>
+      <w:pPr>
+        <w:spacing w:line="276" w:lineRule="auto" w:after="160"/>
+      </w:pPr>
       <w:r>
-        <w:t>Addressing key aspects of Protecting. Patients Beyond Every Order requires. Careful thought of structural hierarchy. Factual alignment, and clear editorial. Implementing verified guidelines ensures publication-ready. Quality across all sections. This comprehensive advice ensures factual. Accuracy, clear structural alignment, and. Practical utility for readers and. Domain experts alike.</w:t>
+        <w:t>Addressing key aspects of Protecting Patients Beyond Every Order requires careful thought of structural hierarchy, factual alignment, and clear editorial standards. Implementing verified guidelines ensures publication-ready quality across all sections. This comprehensive advice ensures factual accuracy, clear structural alignment, and practical utility for readers and domain experts alike.</w:t>
       </w:r>
     </w:p>
     <w:p>
@@ -320,12 +403,18 @@
         <w:pStyle w:val="Heading3"/>
       </w:pPr>
       <w:r>
+        <w:rPr>
+          <w:color w:val="374151"/>
+        </w:rPr>
         <w:t>Key Consideration #6 regarding Protecting Patients Beyond Every Order?</w:t>
       </w:r>
     </w:p>
     <w:p>
+      <w:pPr>
+        <w:spacing w:line="276" w:lineRule="auto" w:after="160"/>
+      </w:pPr>
       <w:r>
-        <w:t>Addressing key aspects of Protecting. Patients Beyond Every Order requires. Careful thought of structural hierarchy. Factual alignment, and clear editorial. Implementing verified guidelines ensures publication-ready. Quality across all sections. This comprehensive advice ensures factual. Accuracy, clear structural alignment, and. Practical utility for readers and. Domain experts alike.</w:t>
+        <w:t>Addressing key aspects of Protecting Patients Beyond Every Order requires careful thought of structural hierarchy, factual alignment, and clear editorial standards. Implementing verified guidelines ensures publication-ready quality across all sections. This comprehensive advice ensures factual accuracy, clear structural alignment, and practical utility for readers and domain experts alike.</w:t>
       </w:r>
     </w:p>
     <w:p>
@@ -333,12 +422,18 @@
         <w:pStyle w:val="Heading3"/>
       </w:pPr>
       <w:r>
+        <w:rPr>
+          <w:color w:val="374151"/>
+        </w:rPr>
         <w:t>Key Consideration #7 regarding Protecting Patients Beyond Every Order?</w:t>
       </w:r>
     </w:p>
     <w:p>
+      <w:pPr>
+        <w:spacing w:line="276" w:lineRule="auto" w:after="160"/>
+      </w:pPr>
       <w:r>
-        <w:t>Addressing key aspects of Protecting. Patients Beyond Every Order requires. Careful thought of structural hierarchy. Factual alignment, and clear editorial. Implementing verified guidelines ensures publication-ready. Quality across all sections. This comprehensive advice ensures factual. Accuracy, clear structural alignment, and. Practical utility for readers and. Domain experts alike.</w:t>
+        <w:t>Addressing key aspects of Protecting Patients Beyond Every Order requires careful thought of structural hierarchy, factual alignment, and clear editorial standards. Implementing verified guidelines ensures publication-ready quality across all sections. This comprehensive advice ensures factual accuracy, clear structural alignment, and practical utility for readers and domain experts alike.</w:t>
       </w:r>
     </w:p>
     <w:sectPr>

</xml_diff>

<commit_message>
feat: Implement 4-Version editorial workflow with Version 4 reconstructed 100% locally in Python (0 LLM calls)
</commit_message>
<xml_diff>
--- a/output/final_doc/What Happens to Expired or Rejected Medicines_humanized.docx
+++ b/output/final_doc/What Happens to Expired or Rejected Medicines_humanized.docx
@@ -42,7 +42,7 @@
         <w:spacing w:line="276" w:lineRule="auto" w:after="160"/>
       </w:pPr>
       <w:r>
-        <w:t>When you order a medicine, one of the questions you may have is. "How do I know I won't receive an expired or damaged medicine?". It's a valid concern. Medicines are meant to improve your health, but only when they are stored correctly, handled carefully, and used within their shelf life. At Tata 1mg, expired, damaged, rejected, or recalled medicines are never sold to customers. They are identified through defined quality steps, removed from active stock, and handled through approved return or disposal steps. This page explains how these medicines are identified, why they are removed, and what happens to them after they leave our active stock. Every medicine has a defined shelf life.</w:t>
+        <w:t>When you order a medicine, one of the questions you may have is. "How do I know I won't receive an expired or damaged medicine?". It's a valid concern. Medicines are meant to improve your health, but only when they are stored correctly, handled carefully, and used within their shelf life. At Tata 1mg, expired, damaged, rejected, or recalled medicines are never sold to customers. They are identified through defined quality steps, removed from active stock, and handled through approved return or disposal steps. This page explains how these medicines are identified, why they are removed, and what happens to them after they leave our active stock. Every medicine has a defined shelf life. The most common reasons include.</w:t>
       </w:r>
     </w:p>
     <w:p>
@@ -61,7 +61,7 @@
         <w:spacing w:line="276" w:lineRule="auto" w:after="160"/>
       </w:pPr>
       <w:r>
-        <w:t>Every medicine is monitored using its batch number and expiry date. Our stock systems identify medicines near their expiry well before they become unfit for dispatch. Medicines that do not meet our dispatch rules are removed from active stock and cannot be included in customer orders. Every medicine is monitored using its batch number and expiry date. Our stock systems identify medicines near their expiry well before they become unfit for dispatch.</w:t>
+        <w:t>Every medicine is monitored using its batch number and expiry date. Our stock systems identify medicines near their expiry well before they become unfit for dispatch. Medicines that do not meet our dispatch rules are removed from active stock and cannot be included in customer orders. Our stock systems identify medicines near their expiry well before they become unfit for dispatch.</w:t>
       </w:r>
     </w:p>
     <w:p>
@@ -80,7 +80,7 @@
         <w:spacing w:line="276" w:lineRule="auto" w:after="160"/>
       </w:pPr>
       <w:r>
-        <w:t>Medicines may occasionally be damaged during transit, storage, or returns handling. Examples include. Torn or crushed packaging. Broken seals. Water damage. Visible contamination. Physical damage to the product. If a medicine does not meet quality standards, it is separated from active stock for further review. Medicines may occasionally be damaged during transit, storage, or returns handling. Examples include: Torn or crushed packaging.</w:t>
+        <w:t>Medicines may occasionally be damaged during transit, storage, or returns handling. Examples include. Torn or crushed packaging. Broken seals. Water damage. Visible contamination. Physical damage to the product. If a medicine does not meet quality standards, it is separated from active stock for further review. Examples include.</w:t>
       </w:r>
     </w:p>
     <w:p>
@@ -99,7 +99,7 @@
         <w:spacing w:line="276" w:lineRule="auto" w:after="160"/>
       </w:pPr>
       <w:r>
-        <w:t>Sometimes customers return medicines because of delivery issues or other concerns. Returned medicines are carefully assessed before any decision is made. Products that do not meet quality rules are not placed back into stock. This approach helps reduce the possibility of compromised medicines reaching another customer. Sometimes customers return medicines because of delivery issues or other concerns.</w:t>
+        <w:t>Sometimes customers return medicines because of delivery issues or other concerns. Returned medicines are carefully assessed before any decision is made. Products that do not meet quality rules are not placed back into stock. This approach helps reduce the possibility of compromised medicines reaching another customer. Returned medicines are carefully assessed before any decision is made.</w:t>
       </w:r>
     </w:p>
     <w:p>
@@ -118,7 +118,7 @@
         <w:spacing w:line="276" w:lineRule="auto" w:after="160"/>
       </w:pPr>
       <w:r>
-        <w:t>On rare occasions, manufacturers or regulatory officials may recall specific batches of medicines. When this happens, affected batches are immediately blocked within our stock systems. Once blocked, these medicines cannot be picked, packed, or dispatched as part of any customer order. Removing a medicine from stock is only the first step. The next step is making sure it cannot accidentally return to the supply chain. On rare occasions, manufacturers or regulatory officials may recall specific batches of medicines.</w:t>
+        <w:t>On rare occasions, manufacturers or regulatory officials may recall specific batches of medicines. When this happens, affected batches are immediately blocked within our stock systems. Once blocked, these medicines cannot be picked, packed, or dispatched as part of any customer order. Removing a medicine from stock is only the first step. The next step is making sure it cannot accidentally return to the supply chain.</w:t>
       </w:r>
     </w:p>
     <w:p>
@@ -137,7 +137,7 @@
         <w:spacing w:line="276" w:lineRule="auto" w:after="160"/>
       </w:pPr>
       <w:r>
-        <w:t>Medicines identified as expired, damaged, rejected, or recalled are digitally marked as non-sellable. This prevents them from appearing in any order delivery step. At the same time, they are physically separated from medicines that remain available for sale. Both digital and physical controls work together to reduce the possibility of accidental dispatch. Medicines identified as expired, damaged, rejected, or recalled are digitally marked as non-sellable.</w:t>
+        <w:t>Medicines identified as expired, damaged, rejected, or recalled are digitally marked as non-sellable. This prevents them from appearing in any order delivery step. At the same time, they are physically separated from medicines that remain available for sale. Both digital and physical controls work together to reduce the possibility of accidental dispatch. This prevents them from appearing in any order delivery step.</w:t>
       </w:r>
     </w:p>
     <w:p>
@@ -156,7 +156,7 @@
         <w:spacing w:line="276" w:lineRule="auto" w:after="160"/>
       </w:pPr>
       <w:r>
-        <w:t>Where possible, medicines are returned to the original manufacturer or approved supplier through documented return steps. These returns are recorded with relevant information such as. Batch number. Quantity. Reason for return. Date of return. Maintaining this records supports tracking and duty. Where possible, medicines are returned to the original manufacturer or approved supplier through documented return steps. These returns are recorded with relevant information such as: Batch number.</w:t>
+        <w:t>Where possible, medicines are returned to the original manufacturer or approved supplier through documented return steps. These returns are recorded with relevant information such as. Batch number. Quantity. Reason for return. Date of return. Maintaining this records supports tracking and duty. These returns are recorded with relevant information such as.</w:t>
       </w:r>
     </w:p>
     <w:p>
@@ -175,7 +175,7 @@
         <w:spacing w:line="276" w:lineRule="auto" w:after="160"/>
       </w:pPr>
       <w:r>
-        <w:t>Some medicines cannot be returned. For example, severely damaged products or medicines that have exceeded return timelines may require disposal. Medicines are not disposed of like ordinary household waste. They contain active ingredients that need to be handled responsibly to help protect people and the environment. Where disposal is required, it is carried out through approved steps in agreement with applicable laws. Most customers never see these steps.</w:t>
+        <w:t>Some medicines cannot be returned. For example, severely damaged products or medicines that have exceeded return timelines may require disposal. Medicines are not disposed of like ordinary household waste. They contain active ingredients that need to be handled responsibly to help protect people and the environment. Where disposal is required, it is carried out through approved steps in agreement with applicable laws. Most customers never see. You can check. ✅ Medicine name. ✅ Strength. ✅ Batch number. ✅ Expiry date. ✅ Packaging condition. ✅ Signs of damage or tampering. If you notice anything unusual, avoid using the medicine until you've spoken with Tata 1mg customer support or your healthcare professional.</w:t>
       </w:r>
     </w:p>
     <w:p>
@@ -194,7 +194,7 @@
         <w:spacing w:line="276" w:lineRule="auto" w:after="160"/>
       </w:pPr>
       <w:r>
-        <w:t>Medicines identified as expired or no longer eligible for dispatch are removed from active stock before customer orders are fulfilled. No.</w:t>
+        <w:t>No. Medicines identified as expired or no longer eligible for dispatch are removed from active stock before customer orders are fulfilled.</w:t>
       </w:r>
     </w:p>
     <w:p>
@@ -251,7 +251,7 @@
         <w:spacing w:line="276" w:lineRule="auto" w:after="160"/>
       </w:pPr>
       <w:r>
-        <w:t>Returned medicines are assessed through defined quality steps. Products that do not meet quality rules are not returned to active stock. Returned medicines are assessed through defined quality steps.</w:t>
+        <w:t>Returned medicines are assessed through defined quality steps. Products that do not meet quality rules are not returned to active stock.</w:t>
       </w:r>
     </w:p>
     <w:p>
@@ -289,7 +289,7 @@
         <w:spacing w:line="276" w:lineRule="auto" w:after="160"/>
       </w:pPr>
       <w:r>
-        <w:t>Do not use the medicine. Contact Tata 1mg customer support so the concern can be reviewed. Medicine safety is not only about delivering the right medicine. It is also about making sure the wrong medicine never reaches you. By identifying expired, damaged, rejected, and recalled medicines early, removing them from active stock, and handling them through approved return or disposal steps, Tata 1mg helps support the quality and safety of every order. Many of these steps happen quietly behind the scenes.</w:t>
+        <w:t>Do not use the medicine. Contact Tata 1mg customer support so the concern can be reviewed. Medicine safety is not only about delivering the right medicine. It is also about making sure the wrong medicine never reaches you. By identifying expired, damaged, rejected, and recalled medicines early, removing them from active stock, and handling them through approved return or disposal steps, Tata 1mg the quality and safety of every order. Many of happen quietly behind the scenes. They are give you confidence that the medicine delivered to your doorstep has passed through multiple quality checks before it reaches you.</w:t>
       </w:r>
     </w:p>
     <w:p>

</xml_diff>